<commit_message>
chore: repo hygiene (assets unification, css dedupe, tailwind content, legacy cleanup)
</commit_message>
<xml_diff>
--- a/ACTION PLAN - BY ASH & EMMA.docx
+++ b/ACTION PLAN - BY ASH & EMMA.docx
@@ -26,17 +26,6 @@
     <w:p>
       <w:pPr>
         <w:rPr>
-          <w:rFonts w:ascii="Segoe UI Emoji" w:hAnsi="Segoe UI Emoji" w:cs="Segoe UI Emoji"/>
-          <w:b/>
-          <w:bCs/>
-          <w:sz w:val="28"/>
-          <w:szCs w:val="28"/>
-        </w:rPr>
-      </w:pPr>
-    </w:p>
-    <w:p>
-      <w:pPr>
-        <w:rPr>
           <w:b/>
           <w:bCs/>
         </w:rPr>
@@ -375,7 +364,6 @@
           <w:b/>
           <w:bCs/>
         </w:rPr>
-        <w:lastRenderedPageBreak/>
         <w:t>AI-Generated video (from EMMA prompts)</w:t>
       </w:r>
       <w:r>
@@ -409,6 +397,7 @@
     </w:p>
     <w:p>
       <w:r>
+        <w:lastRenderedPageBreak/>
         <w:t>“AHKStrategies — Where Vision Becomes Intelligence.”</w:t>
       </w:r>
     </w:p>
@@ -708,7 +697,6 @@
           <w:b/>
           <w:bCs/>
         </w:rPr>
-        <w:lastRenderedPageBreak/>
         <w:t>⚙️</w:t>
       </w:r>
       <w:r>
@@ -772,6 +760,7 @@
           <w:b/>
           <w:bCs/>
         </w:rPr>
+        <w:lastRenderedPageBreak/>
         <w:t>AI &amp; Digital Integrated Solutions</w:t>
       </w:r>
     </w:p>
@@ -1162,87 +1151,87 @@
     </w:p>
     <w:p>
       <w:r>
+        <w:t xml:space="preserve">│   │   </w:t>
+      </w:r>
+      <w:r>
+        <w:rPr>
+          <w:rFonts w:ascii="MS Gothic" w:eastAsia="MS Gothic" w:hAnsi="MS Gothic" w:cs="MS Gothic" w:hint="eastAsia"/>
+        </w:rPr>
+        <w:t>├</w:t>
+      </w:r>
+      <w:r>
+        <w:rPr>
+          <w:rFonts w:ascii="Aptos" w:hAnsi="Aptos" w:cs="Aptos"/>
+        </w:rPr>
+        <w:t>──</w:t>
+      </w:r>
+      <w:r>
+        <w:t xml:space="preserve"> about.html</w:t>
+      </w:r>
+    </w:p>
+    <w:p>
+      <w:r>
+        <w:t xml:space="preserve">│   │   </w:t>
+      </w:r>
+      <w:r>
+        <w:rPr>
+          <w:rFonts w:ascii="MS Gothic" w:eastAsia="MS Gothic" w:hAnsi="MS Gothic" w:cs="MS Gothic" w:hint="eastAsia"/>
+        </w:rPr>
+        <w:t>├</w:t>
+      </w:r>
+      <w:r>
+        <w:rPr>
+          <w:rFonts w:ascii="Aptos" w:hAnsi="Aptos" w:cs="Aptos"/>
+        </w:rPr>
+        <w:t>──</w:t>
+      </w:r>
+      <w:r>
+        <w:t xml:space="preserve"> divisions.html</w:t>
+      </w:r>
+    </w:p>
+    <w:p>
+      <w:r>
+        <w:t xml:space="preserve">│   │   </w:t>
+      </w:r>
+      <w:r>
+        <w:rPr>
+          <w:rFonts w:ascii="MS Gothic" w:eastAsia="MS Gothic" w:hAnsi="MS Gothic" w:cs="MS Gothic" w:hint="eastAsia"/>
+        </w:rPr>
+        <w:t>├</w:t>
+      </w:r>
+      <w:r>
+        <w:rPr>
+          <w:rFonts w:ascii="Aptos" w:hAnsi="Aptos" w:cs="Aptos"/>
+        </w:rPr>
+        <w:t>──</w:t>
+      </w:r>
+      <w:r>
+        <w:t xml:space="preserve"> projects.html</w:t>
+      </w:r>
+    </w:p>
+    <w:p>
+      <w:r>
+        <w:t xml:space="preserve">│   │   </w:t>
+      </w:r>
+      <w:r>
+        <w:rPr>
+          <w:rFonts w:ascii="MS Gothic" w:eastAsia="MS Gothic" w:hAnsi="MS Gothic" w:cs="MS Gothic" w:hint="eastAsia"/>
+        </w:rPr>
+        <w:t>├</w:t>
+      </w:r>
+      <w:r>
+        <w:rPr>
+          <w:rFonts w:ascii="Aptos" w:hAnsi="Aptos" w:cs="Aptos"/>
+        </w:rPr>
+        <w:t>──</w:t>
+      </w:r>
+      <w:r>
+        <w:t xml:space="preserve"> services.html</w:t>
+      </w:r>
+    </w:p>
+    <w:p>
+      <w:r>
         <w:lastRenderedPageBreak/>
-        <w:t xml:space="preserve">│   │   </w:t>
-      </w:r>
-      <w:r>
-        <w:rPr>
-          <w:rFonts w:ascii="MS Gothic" w:eastAsia="MS Gothic" w:hAnsi="MS Gothic" w:cs="MS Gothic" w:hint="eastAsia"/>
-        </w:rPr>
-        <w:t>├</w:t>
-      </w:r>
-      <w:r>
-        <w:rPr>
-          <w:rFonts w:ascii="Aptos" w:hAnsi="Aptos" w:cs="Aptos"/>
-        </w:rPr>
-        <w:t>──</w:t>
-      </w:r>
-      <w:r>
-        <w:t xml:space="preserve"> about.html</w:t>
-      </w:r>
-    </w:p>
-    <w:p>
-      <w:r>
-        <w:t xml:space="preserve">│   │   </w:t>
-      </w:r>
-      <w:r>
-        <w:rPr>
-          <w:rFonts w:ascii="MS Gothic" w:eastAsia="MS Gothic" w:hAnsi="MS Gothic" w:cs="MS Gothic" w:hint="eastAsia"/>
-        </w:rPr>
-        <w:t>├</w:t>
-      </w:r>
-      <w:r>
-        <w:rPr>
-          <w:rFonts w:ascii="Aptos" w:hAnsi="Aptos" w:cs="Aptos"/>
-        </w:rPr>
-        <w:t>──</w:t>
-      </w:r>
-      <w:r>
-        <w:t xml:space="preserve"> divisions.html</w:t>
-      </w:r>
-    </w:p>
-    <w:p>
-      <w:r>
-        <w:t xml:space="preserve">│   │   </w:t>
-      </w:r>
-      <w:r>
-        <w:rPr>
-          <w:rFonts w:ascii="MS Gothic" w:eastAsia="MS Gothic" w:hAnsi="MS Gothic" w:cs="MS Gothic" w:hint="eastAsia"/>
-        </w:rPr>
-        <w:t>├</w:t>
-      </w:r>
-      <w:r>
-        <w:rPr>
-          <w:rFonts w:ascii="Aptos" w:hAnsi="Aptos" w:cs="Aptos"/>
-        </w:rPr>
-        <w:t>──</w:t>
-      </w:r>
-      <w:r>
-        <w:t xml:space="preserve"> projects.html</w:t>
-      </w:r>
-    </w:p>
-    <w:p>
-      <w:r>
-        <w:t xml:space="preserve">│   │   </w:t>
-      </w:r>
-      <w:r>
-        <w:rPr>
-          <w:rFonts w:ascii="MS Gothic" w:eastAsia="MS Gothic" w:hAnsi="MS Gothic" w:cs="MS Gothic" w:hint="eastAsia"/>
-        </w:rPr>
-        <w:t>├</w:t>
-      </w:r>
-      <w:r>
-        <w:rPr>
-          <w:rFonts w:ascii="Aptos" w:hAnsi="Aptos" w:cs="Aptos"/>
-        </w:rPr>
-        <w:t>──</w:t>
-      </w:r>
-      <w:r>
-        <w:t xml:space="preserve"> services.html</w:t>
-      </w:r>
-    </w:p>
-    <w:p>
-      <w:r>
         <w:t>│   │   └── contact.html</w:t>
       </w:r>
     </w:p>
@@ -1589,7 +1578,6 @@
           <w:b/>
           <w:bCs/>
         </w:rPr>
-        <w:lastRenderedPageBreak/>
         <w:t>🎥</w:t>
       </w:r>
       <w:r>
@@ -1650,6 +1638,7 @@
           <w:i/>
           <w:iCs/>
         </w:rPr>
+        <w:lastRenderedPageBreak/>
         <w:t>“A futuristic holographic dashboard showing AHKStrategies’ global presence — neon tones, dark cosmic background.”</w:t>
       </w:r>
     </w:p>
@@ -2244,7 +2233,6 @@
           <w:b/>
           <w:bCs/>
         </w:rPr>
-        <w:lastRenderedPageBreak/>
         <w:t>Motion:</w:t>
       </w:r>
       <w:r>
@@ -2283,6 +2271,7 @@
     </w:p>
     <w:p>
       <w:r>
+        <w:lastRenderedPageBreak/>
         <w:t>“AHKStrategies — More than a company. A living mind built to create futures.”</w:t>
       </w:r>
       <w:r>

</xml_diff>